<commit_message>
Actualiza documentacion y mapas mentales
</commit_message>
<xml_diff>
--- a/00 Analizador de ideas/resumen_ejecutivo_ia_pulycort.docx
+++ b/00 Analizador de ideas/resumen_ejecutivo_ia_pulycort.docx
@@ -4443,7 +4443,7 @@
     <w:lsdException w:name="Medium Shading 1 Accent 1" w:semiHidden="0" w:uiPriority="63" w:unhideWhenUsed="0"/>
     <w:lsdException w:name="Medium Shading 2 Accent 1" w:semiHidden="0" w:uiPriority="64" w:unhideWhenUsed="0"/>
     <w:lsdException w:name="Medium List 1 Accent 1" w:semiHidden="0" w:uiPriority="65" w:unhideWhenUsed="0"/>
-    <w:lsdException w:name="Revision" w:unhideWhenUsed="0"/>
+    <w:lsdException w:name="Revisión" w:unhideWhenUsed="0"/>
     <w:lsdException w:name="List Paragraph" w:semiHidden="0" w:uiPriority="34" w:unhideWhenUsed="0" w:qFormat="1"/>
     <w:lsdException w:name="Quote" w:semiHidden="0" w:uiPriority="29" w:unhideWhenUsed="0" w:qFormat="1"/>
     <w:lsdException w:name="Intense Quote" w:semiHidden="0" w:uiPriority="30" w:unhideWhenUsed="0" w:qFormat="1"/>
@@ -16298,7 +16298,7 @@
     <w:lsdException w:name="Medium Shading 1 Accent 1" w:semiHidden="0" w:uiPriority="63" w:unhideWhenUsed="0"/>
     <w:lsdException w:name="Medium Shading 2 Accent 1" w:semiHidden="0" w:uiPriority="64" w:unhideWhenUsed="0"/>
     <w:lsdException w:name="Medium List 1 Accent 1" w:semiHidden="0" w:uiPriority="65" w:unhideWhenUsed="0"/>
-    <w:lsdException w:name="Revision" w:unhideWhenUsed="0"/>
+    <w:lsdException w:name="Revisión" w:unhideWhenUsed="0"/>
     <w:lsdException w:name="List Paragraph" w:semiHidden="0" w:uiPriority="34" w:unhideWhenUsed="0" w:qFormat="1"/>
     <w:lsdException w:name="Quote" w:semiHidden="0" w:uiPriority="29" w:unhideWhenUsed="0" w:qFormat="1"/>
     <w:lsdException w:name="Intense Quote" w:semiHidden="0" w:uiPriority="30" w:unhideWhenUsed="0" w:qFormat="1"/>

</xml_diff>